<commit_message>
CCPT002: Client-Server Communication Flow (cont)
</commit_message>
<xml_diff>
--- a/cisco-lab/documents/Docs261026 - Client-Server Communication Flow.docx
+++ b/cisco-lab/documents/Docs261026 - Client-Server Communication Flow.docx
@@ -48,24 +48,72 @@
           <w:sz w:val="20"/>
           <w:szCs w:val="32"/>
         </w:rPr>
-        <w:t>This project demonstrates a simple network topology using one router, two switches, one laptop, and one server. The network is designed to connect an end-user device to a server through network infrastructure devices.</w:t>
-      </w:r>
-    </w:p>
-    <w:p>
-      <w:pPr>
-        <w:rPr>
-          <w:rFonts w:ascii="Cambria" w:hAnsi="Cambria"/>
-          <w:sz w:val="20"/>
-          <w:szCs w:val="32"/>
-        </w:rPr>
-      </w:pPr>
-      <w:r>
-        <w:rPr>
-          <w:rFonts w:ascii="Cambria" w:hAnsi="Cambria"/>
-          <w:sz w:val="20"/>
-          <w:szCs w:val="32"/>
-        </w:rPr>
-        <w:t>The router (R1) connects two separate network segments. Switch S1 provides connectivity for Laptop0, while Switch S2 connects the server (Carver0). The router forwards traffic between these two segments, allowing the laptop and server to communicate when the appropriate IP addressing and routing configurations are applied.</w:t>
+        <w:t xml:space="preserve">This project demonstrates a simple network topology using one router, two switches, one </w:t>
+      </w:r>
+      <w:r>
+        <w:rPr>
+          <w:rFonts w:ascii="Cambria" w:hAnsi="Cambria"/>
+          <w:sz w:val="20"/>
+          <w:szCs w:val="32"/>
+        </w:rPr>
+        <w:t>client</w:t>
+      </w:r>
+      <w:r>
+        <w:rPr>
+          <w:rFonts w:ascii="Cambria" w:hAnsi="Cambria"/>
+          <w:sz w:val="20"/>
+          <w:szCs w:val="32"/>
+        </w:rPr>
+        <w:t>, and one server. The network is designed to connect an end-user device to a server through network infrastructure devices.</w:t>
+      </w:r>
+    </w:p>
+    <w:p>
+      <w:pPr>
+        <w:rPr>
+          <w:rFonts w:ascii="Cambria" w:hAnsi="Cambria"/>
+          <w:sz w:val="20"/>
+          <w:szCs w:val="32"/>
+        </w:rPr>
+      </w:pPr>
+      <w:r>
+        <w:rPr>
+          <w:rFonts w:ascii="Cambria" w:hAnsi="Cambria"/>
+          <w:sz w:val="20"/>
+          <w:szCs w:val="32"/>
+        </w:rPr>
+        <w:t xml:space="preserve">The router (R1) connects two separate network segments. Switch S1 provides connectivity for </w:t>
+      </w:r>
+      <w:r>
+        <w:rPr>
+          <w:rFonts w:ascii="Cambria" w:hAnsi="Cambria"/>
+          <w:sz w:val="20"/>
+          <w:szCs w:val="32"/>
+        </w:rPr>
+        <w:t>Client</w:t>
+      </w:r>
+      <w:r>
+        <w:rPr>
+          <w:rFonts w:ascii="Cambria" w:hAnsi="Cambria"/>
+          <w:sz w:val="20"/>
+          <w:szCs w:val="32"/>
+        </w:rPr>
+        <w:t>, while Switch S2 connects the server (</w:t>
+      </w:r>
+      <w:r>
+        <w:rPr>
+          <w:rFonts w:ascii="Cambria" w:hAnsi="Cambria"/>
+          <w:sz w:val="20"/>
+          <w:szCs w:val="32"/>
+        </w:rPr>
+        <w:t>Server</w:t>
+      </w:r>
+      <w:r>
+        <w:rPr>
+          <w:rFonts w:ascii="Cambria" w:hAnsi="Cambria"/>
+          <w:sz w:val="20"/>
+          <w:szCs w:val="32"/>
+        </w:rPr>
+        <w:t>). The router forwards traffic between these two segments, allowing the laptop and server to communicate when the appropriate IP addressing and routing configurations are applied.</w:t>
       </w:r>
     </w:p>
     <w:p>
@@ -617,6 +665,9 @@
         </w:drawing>
       </w:r>
       <w:r>
+        <w:rPr>
+          <w:noProof/>
+        </w:rPr>
         <w:drawing>
           <wp:anchor distT="0" distB="0" distL="114300" distR="114300" simplePos="0" relativeHeight="251659264" behindDoc="0" locked="0" layoutInCell="1" allowOverlap="1" wp14:anchorId="3B3BE7D3" wp14:editId="599B17DC">
             <wp:simplePos x="0" y="0"/>
@@ -2092,6 +2143,7 @@
   <w:style w:type="character" w:default="1" w:styleId="DefaultParagraphFont">
     <w:name w:val="Default Paragraph Font"/>
     <w:uiPriority w:val="1"/>
+    <w:semiHidden/>
     <w:unhideWhenUsed/>
   </w:style>
   <w:style w:type="table" w:default="1" w:styleId="TableNormal">

</xml_diff>